<commit_message>
Clarify P2 notice response and suspension routes
</commit_message>
<xml_diff>
--- a/products-storage/02-dopraboty-bez-poter/03-uvedomlenie-o-doprabotah.docx
+++ b/products-storage/02-dopraboty-bez-poter/03-uvedomlenie-o-doprabotah.docx
@@ -938,17 +938,17 @@
     </w:p>
     <w:p>
       <w:r>
-        <w:t>□ А. Работы ещё не начаты. Планируемая дата [___]. Просим подтвердить объём по форме 02, рассмотреть расчёт 07 и оформить изменения цены и сроков в документах 11 и 12, если они требуются. Для сообщения о неучтённых в технической документации работах срок ответа — десять дней по п. 3 ст. 743 ГК РФ, если законом или договором строительного подряда не предусмотрен иной срок.</w:t>
+        <w:t>□ А. Работы ещё не начаты. Планируемая дата [___]. Просим подтвердить объём по форме 02, рассмотреть расчёт 07 и оформить изменения цены и сроков в документах 11 и 12, если они требуются. Для сообщения о неучтённых в технической документации работах: если ответ не получен в течение десяти дней и законом или договором строительного подряда не предусмотрен иной срок, подрядчик по п. 3 ст. 743 ГК РФ обязан приостановить соответствующие работы.</w:t>
       </w:r>
     </w:p>
     <w:p>
       <w:r>
-        <w:t>□ Б. Работы уже выполнены. Период [___] — [___]. Просьба / указание получена от [___] по документу [___]. Факт и границы подтверждаются [___]. Просим рассмотреть объём, цену, приёмку и срок на основании приложений.</w:t>
+        <w:t>□ Б. Работы уже выполнены. Период [___] — [___]. Просьба / указание получена от [___] по документу [___]. Факт и границы подтверждаются [___]. Просим рассмотреть объём, цену, приёмку и срок на основании приложений. Предложенный срок ответа [___], условие договора о сроке [___].</w:t>
       </w:r>
     </w:p>
     <w:p>
       <w:r>
-        <w:t>Просим направить письменное решение по позициям и сообщить уполномоченное лицо. Для маршрута Б предложенный срок ответа [___], условие договора о сроке [___]. Способ направления ответа [___].</w:t>
+        <w:t>Просим направить письменное решение по позициям и сообщить уполномоченное лицо. Способ направления ответа [___].</w:t>
       </w:r>
     </w:p>
     <w:p>
@@ -1014,7 +1014,7 @@
                 <w:color w:val="262F37"/>
                 <w:sz w:val="18"/>
               </w:rPr>
-              <w:t>Ожидаемые работы / уже выполненные / соответствующие работы приостановлены: [___]</w:t>
+              <w:t>Ожидаемые работы / уже выполненные [___]. Если работы приостановлены: с [___], основание п. 3 ст. 743 после срока / п. 1 ст. 716 / пункт договора [___]</w:t>
             </w:r>
           </w:p>
         </w:tc>

</xml_diff>